<commit_message>
docs: record PR8 hostname and certificate checks
</commit_message>
<xml_diff>
--- a/Отчёты/Практическая работа №8 Контрольная работа №2.docx
+++ b/Отчёты/Практическая работа №8 Контрольная работа №2.docx
@@ -3961,7 +3961,7 @@
     </w:p>
     <w:p>
       <w:r>
-        <w:t>Приложение развёрнуто на devops-vm. Проверены HTTPS, Redis healthy, работа без root, права 600 и неизменность UFW. Аудит: 14 успешных проверок, 0 ошибок. С Mac HTTPS возвращает scheme: https, client: 192.168.56.1, host: api.devops.local; прямой доступ к 8001 завершается тайм-аутом. После down и up счётчик вырос с 4 до 5, данные сохранились. Созданы снимки 06-before-kr2 и 07-kr2. Создан личный репозиторий и открыт PR №1; слияние до защиты не выполнялось. Доступ с Mac проверен через curl --resolve; запись hosts на Mac пока не добавлена.</w:t>
+        <w:t>Приложение развёрнуто на devops-vm. Проверены HTTPS, Redis healthy, работа без root, права 600 и неизменность UFW. Аудит: 14 успешных проверок, 0 ошибок. С Mac HTTPS возвращает scheme: https, client: 192.168.56.1, host: api.devops.local; прямой доступ к 8001 завершается тайм-аутом. После down и up счётчик вырос с 4 до 5, данные сохранились. Созданы снимки 06-before-kr2 и 07-kr2. Создан личный репозиторий и открыт PR №1; слияние до защиты не выполнялось. Запись hosts на Mac добавлена. Запрос по имени с curl --cacert без --resolve вернул KR2 | Galanov | container bac0f7513d4b | hits: 6.</w:t>
       </w:r>
     </w:p>
     <w:p>
@@ -4360,6 +4360,67 @@
         <w:t>Открытый Pull Request в личном GitHub</w:t>
       </w:r>
     </w:p>
+    <w:p>
+      <w:pPr>
+        <w:pStyle w:val="Heading1"/>
+        <w:pageBreakBefore/>
+      </w:pPr>
+      <w:r>
+        <w:t>10 Проверка имени с хостовой системы</w:t>
+      </w:r>
+    </w:p>
+    <w:p>
+      <w:pPr>
+        <w:keepLines/>
+      </w:pPr>
+      <w:r>
+        <w:t>На Mac добавлена запись 192.168.56.101 api.devops.local. Команда curl --cacert с сертификатом kr2.crt успешно проверяет цепочку доверия и имя сертификата. Chrome показывает NET::ERR_CERT_AUTHORITY_INVALID, поскольку самоподписанный сертификат не включён в его доверенное хранилище. Ручное исключение для браузера пока не подтверждено.</w:t>
+      </w:r>
+    </w:p>
+    <w:p>
+      <w:r>
+        <w:drawing>
+          <wp:inline xmlns:a="http://schemas.openxmlformats.org/drawingml/2006/main" xmlns:pic="http://schemas.openxmlformats.org/drawingml/2006/picture">
+            <wp:extent cx="5577840" cy="3693934"/>
+            <wp:docPr id="1468553577" name="Picture 1468553577"/>
+            <wp:cNvGraphicFramePr>
+              <a:graphicFrameLocks noChangeAspect="1"/>
+            </wp:cNvGraphicFramePr>
+            <a:graphic>
+              <a:graphicData uri="http://schemas.openxmlformats.org/drawingml/2006/picture">
+                <pic:pic>
+                  <pic:nvPicPr>
+                    <pic:cNvPr id="0" name="09-browser-certificate.png"/>
+                    <pic:cNvPicPr/>
+                  </pic:nvPicPr>
+                  <pic:blipFill>
+                    <a:blip r:embed="rId32"/>
+                    <a:stretch>
+                      <a:fillRect/>
+                    </a:stretch>
+                  </pic:blipFill>
+                  <pic:spPr>
+                    <a:xfrm>
+                      <a:off x="0" y="0"/>
+                      <a:ext cx="5577840" cy="3693934"/>
+                    </a:xfrm>
+                    <a:prstGeom prst="rect"/>
+                  </pic:spPr>
+                </pic:pic>
+              </a:graphicData>
+            </a:graphic>
+          </wp:inline>
+        </w:drawing>
+      </w:r>
+    </w:p>
+    <w:p>
+      <w:pPr>
+        <w:pStyle w:val="Caption"/>
+      </w:pPr>
+      <w:r>
+        <w:t>Ожидаемое предупреждение Chrome для самоподписанного сертификата</w:t>
+      </w:r>
+    </w:p>
     <w:sectPr>
       <w:pgSz w:w="11906" w:h="16838"/>
       <w:pgMar w:top="964" w:right="1134" w:bottom="964" w:left="1134" w:header="720" w:footer="720" w:gutter="0"/>

</xml_diff>

<commit_message>
docs: finalize PR8 browser screenshot and results
</commit_message>
<xml_diff>
--- a/Отчёты/Практическая работа №8 Контрольная работа №2.docx
+++ b/Отчёты/Практическая работа №8 Контрольная работа №2.docx
@@ -4374,14 +4374,14 @@
         <w:keepLines/>
       </w:pPr>
       <w:r>
-        <w:t>На Mac добавлена запись 192.168.56.101 api.devops.local. Команда curl --cacert с сертификатом kr2.crt успешно проверяет цепочку доверия и имя сертификата. Chrome показывает NET::ERR_CERT_AUTHORITY_INVALID, поскольку самоподписанный сертификат не включён в его доверенное хранилище. Ручное исключение для браузера пока не подтверждено.</w:t>
+        <w:t>На Mac добавлена запись 192.168.56.101 api.devops.local. Проверка curl --cacert с сертификатом kr2.crt прошла по доменному имени без --resolve. После ручного подтверждения исключения самоподписанного сертификата в Chrome открылась страница приложения: KR2 | Galanov | container bac0f7513d4b | hits: 7. Пометка «Не защищено» в Chrome сохраняется из-за отсутствия сертификата в доверенном хранилище.</w:t>
       </w:r>
     </w:p>
     <w:p>
       <w:r>
         <w:drawing>
           <wp:inline xmlns:a="http://schemas.openxmlformats.org/drawingml/2006/main" xmlns:pic="http://schemas.openxmlformats.org/drawingml/2006/picture">
-            <wp:extent cx="5577840" cy="3693934"/>
+            <wp:extent cx="5577840" cy="627968"/>
             <wp:docPr id="1468553577" name="Picture 1468553577"/>
             <wp:cNvGraphicFramePr>
               <a:graphicFrameLocks noChangeAspect="1"/>
@@ -4394,7 +4394,8 @@
                     <pic:cNvPicPr/>
                   </pic:nvPicPr>
                   <pic:blipFill>
-                    <a:blip r:embed="rId32"/>
+                    <a:blip r:embed="rId33"/>
+                    <a:srcRect b="83000"/>
                     <a:stretch>
                       <a:fillRect/>
                     </a:stretch>
@@ -4402,7 +4403,7 @@
                   <pic:spPr>
                     <a:xfrm>
                       <a:off x="0" y="0"/>
-                      <a:ext cx="5577840" cy="3693934"/>
+                      <a:ext cx="5577840" cy="627968"/>
                     </a:xfrm>
                     <a:prstGeom prst="rect"/>
                   </pic:spPr>
@@ -4418,7 +4419,7 @@
         <w:pStyle w:val="Caption"/>
       </w:pPr>
       <w:r>
-        <w:t>Ожидаемое предупреждение Chrome для самоподписанного сертификата</w:t>
+        <w:t>Приложение api.devops.local в Chrome после подтверждения исключения сертификата</w:t>
       </w:r>
     </w:p>
     <w:sectPr>

</xml_diff>